<commit_message>
Add BRFplus configuration workbook (7 decision tables with full content, functions, 28 rulesets, messages) and object inventory section in BRFplus doc v1.1
Co-Authored-By: Claude Fable 5 <noreply@anthropic.com>
</commit_message>
<xml_diff>
--- a/Enrollment Center/Enrollment Center - BRFplus Detailed Configuration v1.0.docx
+++ b/Enrollment Center/Enrollment Center - BRFplus Detailed Configuration v1.0.docx
@@ -159,7 +159,7 @@
               <w:rPr>
                 <w:sz w:val="18"/>
               </w:rPr>
-              <w:t>1.0 (Draft for Review)</w:t>
+              <w:t>1.1 (adds Section 11 object inventory; consolidated decision-table model; companion configuration workbook)</w:t>
             </w:r>
           </w:p>
         </w:tc>
@@ -8872,6 +8872,419 @@
       </w:r>
       <w:r>
         <w:t>BRFplus change log + version history reviewed in the monthly governance meeting (CS-02 pattern); eligibility statistics (rule 900 counters) feed the program adoption dashboard.</w:t>
+      </w:r>
+    </w:p>
+    <w:p>
+      <w:pPr>
+        <w:pStyle w:val="Heading1"/>
+      </w:pPr>
+      <w:r>
+        <w:t>11. Object Inventory and Consolidated Implementation Model</w:t>
+      </w:r>
+    </w:p>
+    <w:p>
+      <w:r>
+        <w:rPr>
+          <w:b w:val="0"/>
+        </w:rPr>
+        <w:t>Definitive object counts for build planning. The per-program condition content of Section 5.4 is implemented in a CONSOLIDATED model: criteria-matrix decision tables carry one ROW per program instead of one table per program. The naive per-program alternative (DT_&lt;PGM&gt;_HARDSTOPS / DT_&lt;PGM&gt;_WARNINGS) would require 40 decision tables; the consolidated model requires 7 and concentrates business maintenance in two matrices. Productive content for every table ships in the companion workbook 'Enrollment Center – BRFplus Configuration Workbook v1.0.xlsx' (one sheet per decision table, structured for BRFplus Workbench Excel import).</w:t>
+      </w:r>
+    </w:p>
+    <w:tbl>
+      <w:tblPr>
+        <w:tblStyle w:val="TableGrid"/>
+        <w:tblW w:type="auto" w:w="0"/>
+        <w:jc w:val="center"/>
+        <w:tblLayout w:type="fixed"/>
+        <w:tblLook w:firstColumn="1" w:firstRow="1" w:lastColumn="0" w:lastRow="0" w:noHBand="0" w:noVBand="1" w:val="04A0"/>
+      </w:tblPr>
+      <w:tblGrid>
+        <w:gridCol w:w="2880"/>
+        <w:gridCol w:w="2880"/>
+        <w:gridCol w:w="2880"/>
+      </w:tblGrid>
+      <w:tr>
+        <w:tc>
+          <w:tcPr>
+            <w:tcW w:type="dxa" w:w="2304"/>
+            <w:shd w:val="clear" w:fill="1F4E79"/>
+          </w:tcPr>
+          <w:p>
+            <w:r/>
+            <w:r>
+              <w:rPr>
+                <w:b/>
+                <w:color w:val="FFFFFF"/>
+                <w:sz w:val="17"/>
+              </w:rPr>
+              <w:t>Object Type</w:t>
+            </w:r>
+          </w:p>
+        </w:tc>
+        <w:tc>
+          <w:tcPr>
+            <w:tcW w:type="dxa" w:w="1440"/>
+            <w:shd w:val="clear" w:fill="1F4E79"/>
+          </w:tcPr>
+          <w:p>
+            <w:r/>
+            <w:r>
+              <w:rPr>
+                <w:b/>
+                <w:color w:val="FFFFFF"/>
+                <w:sz w:val="17"/>
+              </w:rPr>
+              <w:t>Count</w:t>
+            </w:r>
+          </w:p>
+        </w:tc>
+        <w:tc>
+          <w:tcPr>
+            <w:tcW w:type="dxa" w:w="5616"/>
+            <w:shd w:val="clear" w:fill="1F4E79"/>
+          </w:tcPr>
+          <w:p>
+            <w:r/>
+            <w:r>
+              <w:rPr>
+                <w:b/>
+                <w:color w:val="FFFFFF"/>
+                <w:sz w:val="17"/>
+              </w:rPr>
+              <w:t>Objects</w:t>
+            </w:r>
+          </w:p>
+        </w:tc>
+      </w:tr>
+      <w:tr>
+        <w:tc>
+          <w:tcPr>
+            <w:tcW w:type="dxa" w:w="2304"/>
+          </w:tcPr>
+          <w:p>
+            <w:r/>
+            <w:r>
+              <w:rPr>
+                <w:sz w:val="17"/>
+              </w:rPr>
+              <w:t>Application</w:t>
+            </w:r>
+          </w:p>
+        </w:tc>
+        <w:tc>
+          <w:tcPr>
+            <w:tcW w:type="dxa" w:w="1440"/>
+          </w:tcPr>
+          <w:p>
+            <w:r/>
+            <w:r>
+              <w:rPr>
+                <w:sz w:val="17"/>
+              </w:rPr>
+              <w:t>1</w:t>
+            </w:r>
+          </w:p>
+        </w:tc>
+        <w:tc>
+          <w:tcPr>
+            <w:tcW w:type="dxa" w:w="5616"/>
+          </w:tcPr>
+          <w:p>
+            <w:r/>
+            <w:r>
+              <w:rPr>
+                <w:sz w:val="17"/>
+              </w:rPr>
+              <w:t>ZEC_PROGRAM_ELIGIBILITY</w:t>
+            </w:r>
+          </w:p>
+        </w:tc>
+      </w:tr>
+      <w:tr>
+        <w:tc>
+          <w:tcPr>
+            <w:tcW w:type="dxa" w:w="2304"/>
+            <w:shd w:val="clear" w:fill="DEEAF6"/>
+          </w:tcPr>
+          <w:p>
+            <w:r/>
+            <w:r>
+              <w:rPr>
+                <w:sz w:val="17"/>
+              </w:rPr>
+              <w:t>Functions</w:t>
+            </w:r>
+          </w:p>
+        </w:tc>
+        <w:tc>
+          <w:tcPr>
+            <w:tcW w:type="dxa" w:w="1440"/>
+            <w:shd w:val="clear" w:fill="DEEAF6"/>
+          </w:tcPr>
+          <w:p>
+            <w:r/>
+            <w:r>
+              <w:rPr>
+                <w:sz w:val="17"/>
+              </w:rPr>
+              <w:t>2</w:t>
+            </w:r>
+          </w:p>
+        </w:tc>
+        <w:tc>
+          <w:tcPr>
+            <w:tcW w:type="dxa" w:w="5616"/>
+            <w:shd w:val="clear" w:fill="DEEAF6"/>
+          </w:tcPr>
+          <w:p>
+            <w:r/>
+            <w:r>
+              <w:rPr>
+                <w:sz w:val="17"/>
+              </w:rPr>
+              <w:t>F_EC_ELIGIBILITY_ALL (event mode); F_EC_DEENROLL_CHECK (functional mode)</w:t>
+            </w:r>
+          </w:p>
+        </w:tc>
+      </w:tr>
+      <w:tr>
+        <w:tc>
+          <w:tcPr>
+            <w:tcW w:type="dxa" w:w="2304"/>
+          </w:tcPr>
+          <w:p>
+            <w:r/>
+            <w:r>
+              <w:rPr>
+                <w:sz w:val="17"/>
+              </w:rPr>
+              <w:t>Rulesets</w:t>
+            </w:r>
+          </w:p>
+        </w:tc>
+        <w:tc>
+          <w:tcPr>
+            <w:tcW w:type="dxa" w:w="1440"/>
+          </w:tcPr>
+          <w:p>
+            <w:r/>
+            <w:r>
+              <w:rPr>
+                <w:sz w:val="17"/>
+              </w:rPr>
+              <w:t>28</w:t>
+            </w:r>
+          </w:p>
+        </w:tc>
+        <w:tc>
+          <w:tcPr>
+            <w:tcW w:type="dxa" w:w="5616"/>
+          </w:tcPr>
+          <w:p>
+            <w:r/>
+            <w:r>
+              <w:rPr>
+                <w:sz w:val="17"/>
+              </w:rPr>
+              <w:t>RS_&lt;PGM&gt;_VALIDATION per program (RS_DPP_INT_VALIDATION retains its legacy name)</w:t>
+            </w:r>
+          </w:p>
+        </w:tc>
+      </w:tr>
+      <w:tr>
+        <w:tc>
+          <w:tcPr>
+            <w:tcW w:type="dxa" w:w="2304"/>
+            <w:shd w:val="clear" w:fill="DEEAF6"/>
+          </w:tcPr>
+          <w:p>
+            <w:r/>
+            <w:r>
+              <w:rPr>
+                <w:sz w:val="17"/>
+              </w:rPr>
+              <w:t>Decision tables</w:t>
+            </w:r>
+          </w:p>
+        </w:tc>
+        <w:tc>
+          <w:tcPr>
+            <w:tcW w:type="dxa" w:w="1440"/>
+            <w:shd w:val="clear" w:fill="DEEAF6"/>
+          </w:tcPr>
+          <w:p>
+            <w:r/>
+            <w:r>
+              <w:rPr>
+                <w:sz w:val="17"/>
+              </w:rPr>
+              <w:t>7</w:t>
+            </w:r>
+          </w:p>
+        </w:tc>
+        <w:tc>
+          <w:tcPr>
+            <w:tcW w:type="dxa" w:w="5616"/>
+            <w:shd w:val="clear" w:fill="DEEAF6"/>
+          </w:tcPr>
+          <w:p>
+            <w:r/>
+            <w:r>
+              <w:rPr>
+                <w:sz w:val="17"/>
+              </w:rPr>
+              <w:t>DT_RATECLASS_MATRIX; DT_PROGRAM_CRITERIA (criteria matrix, 28 rows, drives all generic hard stops); DT_PROGRAM_EXCLUSIONS; DT_WAITING_PERIODS; DT_PROGRAM_WARNINGS (16 warning rows); DT_PREACTIVE_INFO; DT_EXIT_RULES</w:t>
+            </w:r>
+          </w:p>
+        </w:tc>
+      </w:tr>
+      <w:tr>
+        <w:tc>
+          <w:tcPr>
+            <w:tcW w:type="dxa" w:w="2304"/>
+          </w:tcPr>
+          <w:p>
+            <w:r/>
+            <w:r>
+              <w:rPr>
+                <w:sz w:val="17"/>
+              </w:rPr>
+              <w:t>Reusable expressions</w:t>
+            </w:r>
+          </w:p>
+        </w:tc>
+        <w:tc>
+          <w:tcPr>
+            <w:tcW w:type="dxa" w:w="1440"/>
+          </w:tcPr>
+          <w:p>
+            <w:r/>
+            <w:r>
+              <w:rPr>
+                <w:sz w:val="17"/>
+              </w:rPr>
+              <w:t>7</w:t>
+            </w:r>
+          </w:p>
+        </w:tc>
+        <w:tc>
+          <w:tcPr>
+            <w:tcW w:type="dxa" w:w="5616"/>
+          </w:tcPr>
+          <w:p>
+            <w:r/>
+            <w:r>
+              <w:rPr>
+                <w:sz w:val="17"/>
+              </w:rPr>
+              <w:t>EX_RATE_CLASS, EX_WAITING_PERIOD, EX_PROGRAM_EXCLUSION, EX_AMI_CHECK, EX_HIST_MONTHS_OK, EX_SEVERITY_MODE, EX_MSG_APPEND</w:t>
+            </w:r>
+          </w:p>
+        </w:tc>
+      </w:tr>
+      <w:tr>
+        <w:tc>
+          <w:tcPr>
+            <w:tcW w:type="dxa" w:w="2304"/>
+            <w:shd w:val="clear" w:fill="DEEAF6"/>
+          </w:tcPr>
+          <w:p>
+            <w:r/>
+            <w:r>
+              <w:rPr>
+                <w:sz w:val="17"/>
+              </w:rPr>
+              <w:t>Data objects</w:t>
+            </w:r>
+          </w:p>
+        </w:tc>
+        <w:tc>
+          <w:tcPr>
+            <w:tcW w:type="dxa" w:w="1440"/>
+            <w:shd w:val="clear" w:fill="DEEAF6"/>
+          </w:tcPr>
+          <w:p>
+            <w:r/>
+            <w:r>
+              <w:rPr>
+                <w:sz w:val="17"/>
+              </w:rPr>
+              <w:t>4</w:t>
+            </w:r>
+          </w:p>
+        </w:tc>
+        <w:tc>
+          <w:tcPr>
+            <w:tcW w:type="dxa" w:w="5616"/>
+            <w:shd w:val="clear" w:fill="DEEAF6"/>
+          </w:tcPr>
+          <w:p>
+            <w:r/>
+            <w:r>
+              <w:rPr>
+                <w:sz w:val="17"/>
+              </w:rPr>
+              <w:t>CTX_EC_ELIG, CTX_EC_CA, CTX_EC_HIST, RES_EC_ELIG</w:t>
+            </w:r>
+          </w:p>
+        </w:tc>
+      </w:tr>
+      <w:tr>
+        <w:tc>
+          <w:tcPr>
+            <w:tcW w:type="dxa" w:w="2304"/>
+          </w:tcPr>
+          <w:p>
+            <w:r/>
+            <w:r>
+              <w:rPr>
+                <w:sz w:val="17"/>
+              </w:rPr>
+              <w:t>Message class</w:t>
+            </w:r>
+          </w:p>
+        </w:tc>
+        <w:tc>
+          <w:tcPr>
+            <w:tcW w:type="dxa" w:w="1440"/>
+          </w:tcPr>
+          <w:p>
+            <w:r/>
+            <w:r>
+              <w:rPr>
+                <w:sz w:val="17"/>
+              </w:rPr>
+              <w:t>1 (33 messages)</w:t>
+            </w:r>
+          </w:p>
+        </w:tc>
+        <w:tc>
+          <w:tcPr>
+            <w:tcW w:type="dxa" w:w="5616"/>
+          </w:tcPr>
+          <w:p>
+            <w:r/>
+            <w:r>
+              <w:rPr>
+                <w:sz w:val="17"/>
+              </w:rPr>
+              <w:t>ZEC_ELIG</w:t>
+            </w:r>
+          </w:p>
+        </w:tc>
+      </w:tr>
+    </w:tbl>
+    <w:p>
+      <w:pPr>
+        <w:spacing w:after="40"/>
+      </w:pPr>
+    </w:p>
+    <w:p>
+      <w:r>
+        <w:rPr>
+          <w:b w:val="0"/>
+        </w:rPr>
+        <w:t>Mapping note: rule RU_&lt;PGM&gt;_020_HARDSTOPS evaluates the program's row of DT_PROGRAM_CRITERIA through a shared generic expression — each violated criterion appends its fixed ZEC_ELIG message (rate class → 002/003, AMI → 044, AMI comm → 018, prepay/medical/BB/DPA blocks → 052–057, arrears → 071/072, history → 062, load → 080, CA count → 074, extension → 073). Program-specific one-off conditions that do not fit the matrix (e.g., dynamic-rate mutual exclusion 058) remain in DT_PROGRAM_EXCLUSIONS.</w:t>
       </w:r>
     </w:p>
     <w:sectPr>

</xml_diff>

<commit_message>
Sync documentation with demo evolution: per-utility device model + DER assets + combo CA patterns (TDD v1.2, BRFplus v1.2 w/ msg 053 medical dynamic-pricing block, workbook, Runtime v1.1, SDD note, deck URLs/personas); tools canonical for generators
Co-Authored-By: Claude Fable 5 <noreply@anthropic.com>
</commit_message>
<xml_diff>
--- a/Enrollment Center/Enrollment Center - BRFplus Detailed Configuration v1.0.docx
+++ b/Enrollment Center/Enrollment Center - BRFplus Detailed Configuration v1.0.docx
@@ -159,7 +159,7 @@
               <w:rPr>
                 <w:sz w:val="18"/>
               </w:rPr>
-              <w:t>1.1 (adds Section 11 object inventory; consolidated decision-table model; companion configuration workbook)</w:t>
+              <w:t>1.2 (adds medical dynamic-pricing rule 053, DER asset context element, device-status refinement; 34 messages)</w:t>
             </w:r>
           </w:p>
         </w:tc>
@@ -1004,7 +1004,7 @@
               <w:rPr>
                 <w:sz w:val="17"/>
               </w:rPr>
-              <w:t>REQUEST_DATE</w:t>
+              <w:t>T_DER_ASSETS</w:t>
             </w:r>
           </w:p>
         </w:tc>
@@ -1019,7 +1019,7 @@
               <w:rPr>
                 <w:sz w:val="17"/>
               </w:rPr>
-              <w:t>DATS</w:t>
+              <w:t>Table of (ASSET_TYPE, STATUS)</w:t>
             </w:r>
           </w:p>
         </w:tc>
@@ -1027,6 +1027,50 @@
           <w:tcPr>
             <w:tcW w:type="dxa" w:w="4464"/>
             <w:shd w:val="clear" w:fill="DEEAF6"/>
+          </w:tcPr>
+          <w:p>
+            <w:r/>
+            <w:r>
+              <w:rPr>
+                <w:sz w:val="17"/>
+              </w:rPr>
+              <w:t>Customer DER equipment from the DER platform (EV charger, BESS, solar, standby gen) — feeds EVMC/ADR/BESS rules; supplied by the wrapper, empty when platform unavailable (rules degrade to warning)</w:t>
+            </w:r>
+          </w:p>
+        </w:tc>
+      </w:tr>
+      <w:tr>
+        <w:tc>
+          <w:tcPr>
+            <w:tcW w:type="dxa" w:w="2448"/>
+          </w:tcPr>
+          <w:p>
+            <w:r/>
+            <w:r>
+              <w:rPr>
+                <w:sz w:val="17"/>
+              </w:rPr>
+              <w:t>REQUEST_DATE</w:t>
+            </w:r>
+          </w:p>
+        </w:tc>
+        <w:tc>
+          <w:tcPr>
+            <w:tcW w:type="dxa" w:w="2448"/>
+          </w:tcPr>
+          <w:p>
+            <w:r/>
+            <w:r>
+              <w:rPr>
+                <w:sz w:val="17"/>
+              </w:rPr>
+              <w:t>DATS</w:t>
+            </w:r>
+          </w:p>
+        </w:tc>
+        <w:tc>
+          <w:tcPr>
+            <w:tcW w:type="dxa" w:w="4464"/>
           </w:tcPr>
           <w:p>
             <w:r/>
@@ -4451,7 +4495,7 @@
               <w:rPr>
                 <w:sz w:val="15"/>
               </w:rPr>
-              <w:t>No AMI (044); RATE_CLASS≠RES (002); waiting period (045); active CPP (058)</w:t>
+              <w:t>No AMI (044); RATE_CLASS≠RES (002); waiting period (045); active CPP (058); MEDICAL_FLAG (053)</w:t>
             </w:r>
           </w:p>
         </w:tc>
@@ -4511,7 +4555,7 @@
               <w:rPr>
                 <w:sz w:val="15"/>
               </w:rPr>
-              <w:t>No AMI (044); AMI comm disabled (018); ≠RES (002); waiting (045)</w:t>
+              <w:t>No AMI (044); AMI comm disabled (018); ≠RES (002); waiting (045). Note: rebate-only DR — NOT medical-blocked</w:t>
             </w:r>
           </w:p>
         </w:tc>
@@ -4571,7 +4615,7 @@
               <w:rPr>
                 <w:sz w:val="15"/>
               </w:rPr>
-              <w:t>No AMI (044); ≠RES (002); waiting (045); active DPP (058)</w:t>
+              <w:t>No AMI (044); ≠RES (002); waiting (045); active DPP (058); MEDICAL_FLAG (053)</w:t>
             </w:r>
           </w:p>
         </w:tc>
@@ -7008,7 +7052,7 @@
         <w:pStyle w:val="Heading1"/>
       </w:pPr>
       <w:r>
-        <w:t>7. Message Class ZEC_ELIG — Catalog</w:t>
+        <w:t>7. Message Class ZEC_ELIG — Catalog (34 messages)</w:t>
       </w:r>
     </w:p>
     <w:tbl>
@@ -7452,7 +7496,7 @@
               <w:rPr>
                 <w:sz w:val="16"/>
               </w:rPr>
-              <w:t>055</w:t>
+              <w:t>053</w:t>
             </w:r>
           </w:p>
         </w:tc>
@@ -7480,7 +7524,7 @@
               <w:rPr>
                 <w:sz w:val="16"/>
               </w:rPr>
-              <w:t>Not compatible with active Prepay service</w:t>
+              <w:t>Dynamic peak-event pricing not permitted — Medical Baseline / life-support protection</w:t>
             </w:r>
           </w:p>
         </w:tc>
@@ -7497,7 +7541,7 @@
               <w:rPr>
                 <w:sz w:val="16"/>
               </w:rPr>
-              <w:t>056</w:t>
+              <w:t>055</w:t>
             </w:r>
           </w:p>
         </w:tc>
@@ -7527,7 +7571,7 @@
               <w:rPr>
                 <w:sz w:val="16"/>
               </w:rPr>
-              <w:t>Prepay and Budget Billing are mutually exclusive</w:t>
+              <w:t>Not compatible with active Prepay service</w:t>
             </w:r>
           </w:p>
         </w:tc>
@@ -7543,7 +7587,7 @@
               <w:rPr>
                 <w:sz w:val="16"/>
               </w:rPr>
-              <w:t>057</w:t>
+              <w:t>056</w:t>
             </w:r>
           </w:p>
         </w:tc>
@@ -7571,7 +7615,7 @@
               <w:rPr>
                 <w:sz w:val="16"/>
               </w:rPr>
-              <w:t>Prepay requires settlement of the active payment plan first</w:t>
+              <w:t>Prepay and Budget Billing are mutually exclusive</w:t>
             </w:r>
           </w:p>
         </w:tc>
@@ -7588,7 +7632,7 @@
               <w:rPr>
                 <w:sz w:val="16"/>
               </w:rPr>
-              <w:t>058</w:t>
+              <w:t>057</w:t>
             </w:r>
           </w:p>
         </w:tc>
@@ -7618,7 +7662,7 @@
               <w:rPr>
                 <w:sz w:val="16"/>
               </w:rPr>
-              <w:t>Only one dynamic rate program allowed — &amp;1 is active</w:t>
+              <w:t>Prepay requires settlement of the active payment plan first</w:t>
             </w:r>
           </w:p>
         </w:tc>
@@ -7634,7 +7678,7 @@
               <w:rPr>
                 <w:sz w:val="16"/>
               </w:rPr>
-              <w:t>062</w:t>
+              <w:t>058</w:t>
             </w:r>
           </w:p>
         </w:tc>
@@ -7648,7 +7692,7 @@
               <w:rPr>
                 <w:sz w:val="16"/>
               </w:rPr>
-              <w:t>I</w:t>
+              <w:t>E</w:t>
             </w:r>
           </w:p>
         </w:tc>
@@ -7662,7 +7706,7 @@
               <w:rPr>
                 <w:sz w:val="16"/>
               </w:rPr>
-              <w:t>Not yet eligible — requires 12 months billing history at premise (&amp;1 of 12)</w:t>
+              <w:t>Only one dynamic rate program allowed — &amp;1 is active</w:t>
             </w:r>
           </w:p>
         </w:tc>
@@ -7679,7 +7723,7 @@
               <w:rPr>
                 <w:sz w:val="16"/>
               </w:rPr>
-              <w:t>071</w:t>
+              <w:t>062</w:t>
             </w:r>
           </w:p>
         </w:tc>
@@ -7694,7 +7738,7 @@
               <w:rPr>
                 <w:sz w:val="16"/>
               </w:rPr>
-              <w:t>E</w:t>
+              <w:t>I</w:t>
             </w:r>
           </w:p>
         </w:tc>
@@ -7709,7 +7753,7 @@
               <w:rPr>
                 <w:sz w:val="16"/>
               </w:rPr>
-              <w:t>No eligible arrears — program requires a qualifying past-due balance</w:t>
+              <w:t>Not yet eligible — requires 12 months billing history at premise (&amp;1 of 12)</w:t>
             </w:r>
           </w:p>
         </w:tc>
@@ -7725,7 +7769,7 @@
               <w:rPr>
                 <w:sz w:val="16"/>
               </w:rPr>
-              <w:t>072</w:t>
+              <w:t>071</w:t>
             </w:r>
           </w:p>
         </w:tc>
@@ -7753,7 +7797,7 @@
               <w:rPr>
                 <w:sz w:val="16"/>
               </w:rPr>
-              <w:t>No qualifying arrears for a payment plan</w:t>
+              <w:t>No eligible arrears — program requires a qualifying past-due balance</w:t>
             </w:r>
           </w:p>
         </w:tc>
@@ -7770,7 +7814,7 @@
               <w:rPr>
                 <w:sz w:val="16"/>
               </w:rPr>
-              <w:t>073</w:t>
+              <w:t>072</w:t>
             </w:r>
           </w:p>
         </w:tc>
@@ -7800,7 +7844,7 @@
               <w:rPr>
                 <w:sz w:val="16"/>
               </w:rPr>
-              <w:t>A payment extension is already active until &amp;1</w:t>
+              <w:t>No qualifying arrears for a payment plan</w:t>
             </w:r>
           </w:p>
         </w:tc>
@@ -7816,7 +7860,7 @@
               <w:rPr>
                 <w:sz w:val="16"/>
               </w:rPr>
-              <w:t>074</w:t>
+              <w:t>073</w:t>
             </w:r>
           </w:p>
         </w:tc>
@@ -7844,7 +7888,7 @@
               <w:rPr>
                 <w:sz w:val="16"/>
               </w:rPr>
-              <w:t>Summary billing requires at least two contract accounts</w:t>
+              <w:t>A payment extension is already active until &amp;1</w:t>
             </w:r>
           </w:p>
         </w:tc>
@@ -7861,7 +7905,7 @@
               <w:rPr>
                 <w:sz w:val="16"/>
               </w:rPr>
-              <w:t>080</w:t>
+              <w:t>074</w:t>
             </w:r>
           </w:p>
         </w:tc>
@@ -7891,7 +7935,7 @@
               <w:rPr>
                 <w:sz w:val="16"/>
               </w:rPr>
-              <w:t>Curtailable load &amp;1 kW below program minimum &amp;2 kW</w:t>
+              <w:t>Summary billing requires at least two contract accounts</w:t>
             </w:r>
           </w:p>
         </w:tc>
@@ -7907,7 +7951,7 @@
               <w:rPr>
                 <w:sz w:val="16"/>
               </w:rPr>
-              <w:t>090</w:t>
+              <w:t>080</w:t>
             </w:r>
           </w:p>
         </w:tc>
@@ -7921,7 +7965,7 @@
               <w:rPr>
                 <w:sz w:val="16"/>
               </w:rPr>
-              <w:t>I</w:t>
+              <w:t>E</w:t>
             </w:r>
           </w:p>
         </w:tc>
@@ -7935,7 +7979,7 @@
               <w:rPr>
                 <w:sz w:val="16"/>
               </w:rPr>
-              <w:t>Not yet eligible — requires an active contract with billing history</w:t>
+              <w:t>Curtailable load &amp;1 kW below program minimum &amp;2 kW</w:t>
             </w:r>
           </w:p>
         </w:tc>
@@ -7952,7 +7996,7 @@
               <w:rPr>
                 <w:sz w:val="16"/>
               </w:rPr>
-              <w:t>093</w:t>
+              <w:t>090</w:t>
             </w:r>
           </w:p>
         </w:tc>
@@ -7982,7 +8026,7 @@
               <w:rPr>
                 <w:sz w:val="16"/>
               </w:rPr>
-              <w:t>Device installation is scheduled after contract activation</w:t>
+              <w:t>Not yet eligible — requires an active contract with billing history</w:t>
             </w:r>
           </w:p>
         </w:tc>
@@ -7998,7 +8042,7 @@
               <w:rPr>
                 <w:sz w:val="16"/>
               </w:rPr>
-              <w:t>031</w:t>
+              <w:t>093</w:t>
             </w:r>
           </w:p>
         </w:tc>
@@ -8012,7 +8056,7 @@
               <w:rPr>
                 <w:sz w:val="16"/>
               </w:rPr>
-              <w:t>W</w:t>
+              <w:t>I</w:t>
             </w:r>
           </w:p>
         </w:tc>
@@ -8026,7 +8070,7 @@
               <w:rPr>
                 <w:sz w:val="16"/>
               </w:rPr>
-              <w:t>&amp;1 returned payments in last 12 months — supervisor approval required</w:t>
+              <w:t>Device installation is scheduled after contract activation</w:t>
             </w:r>
           </w:p>
         </w:tc>
@@ -8043,7 +8087,7 @@
               <w:rPr>
                 <w:sz w:val="16"/>
               </w:rPr>
-              <w:t>320</w:t>
+              <w:t>031</w:t>
             </w:r>
           </w:p>
         </w:tc>
@@ -8073,7 +8117,7 @@
               <w:rPr>
                 <w:sz w:val="16"/>
               </w:rPr>
-              <w:t>Vehicle/charger telematics compatibility not yet verified</w:t>
+              <w:t>&amp;1 returned payments in last 12 months — supervisor approval required</w:t>
             </w:r>
           </w:p>
         </w:tc>
@@ -8089,7 +8133,7 @@
               <w:rPr>
                 <w:sz w:val="16"/>
               </w:rPr>
-              <w:t>321</w:t>
+              <w:t>320</w:t>
             </w:r>
           </w:p>
         </w:tc>
@@ -8117,7 +8161,7 @@
               <w:rPr>
                 <w:sz w:val="16"/>
               </w:rPr>
-              <w:t>Rebate subject to invoice verification</w:t>
+              <w:t>Vehicle/charger telematics compatibility not yet verified</w:t>
             </w:r>
           </w:p>
         </w:tc>
@@ -8134,7 +8178,7 @@
               <w:rPr>
                 <w:sz w:val="16"/>
               </w:rPr>
-              <w:t>322</w:t>
+              <w:t>321</w:t>
             </w:r>
           </w:p>
         </w:tc>
@@ -8164,7 +8208,7 @@
               <w:rPr>
                 <w:sz w:val="16"/>
               </w:rPr>
-              <w:t>No valid e-mail address on business partner</w:t>
+              <w:t>Rebate subject to invoice verification</w:t>
             </w:r>
           </w:p>
         </w:tc>
@@ -8180,7 +8224,7 @@
               <w:rPr>
                 <w:sz w:val="16"/>
               </w:rPr>
-              <w:t>330</w:t>
+              <w:t>322</w:t>
             </w:r>
           </w:p>
         </w:tc>
@@ -8208,7 +8252,7 @@
               <w:rPr>
                 <w:sz w:val="16"/>
               </w:rPr>
-              <w:t>&amp;1 defaulted payment plans in last 24 months</w:t>
+              <w:t>No valid e-mail address on business partner</w:t>
             </w:r>
           </w:p>
         </w:tc>
@@ -8225,7 +8269,7 @@
               <w:rPr>
                 <w:sz w:val="16"/>
               </w:rPr>
-              <w:t>331</w:t>
+              <w:t>330</w:t>
             </w:r>
           </w:p>
         </w:tc>
@@ -8255,7 +8299,7 @@
               <w:rPr>
                 <w:sz w:val="16"/>
               </w:rPr>
-              <w:t>&amp;1 payment extensions already granted in last 12 months</w:t>
+              <w:t>&amp;1 defaulted payment plans in last 24 months</w:t>
             </w:r>
           </w:p>
         </w:tc>
@@ -8271,7 +8315,7 @@
               <w:rPr>
                 <w:sz w:val="16"/>
               </w:rPr>
-              <w:t>332</w:t>
+              <w:t>331</w:t>
             </w:r>
           </w:p>
         </w:tc>
@@ -8299,7 +8343,7 @@
               <w:rPr>
                 <w:sz w:val="16"/>
               </w:rPr>
-              <w:t>Income verification pending — enrollment provisional</w:t>
+              <w:t>&amp;1 payment extensions already granted in last 12 months</w:t>
             </w:r>
           </w:p>
         </w:tc>
@@ -8316,7 +8360,7 @@
               <w:rPr>
                 <w:sz w:val="16"/>
               </w:rPr>
-              <w:t>333</w:t>
+              <w:t>332</w:t>
             </w:r>
           </w:p>
         </w:tc>
@@ -8346,7 +8390,7 @@
               <w:rPr>
                 <w:sz w:val="16"/>
               </w:rPr>
-              <w:t>Physician certification required within 30 days</w:t>
+              <w:t>Income verification pending — enrollment provisional</w:t>
             </w:r>
           </w:p>
         </w:tc>
@@ -8362,7 +8406,7 @@
               <w:rPr>
                 <w:sz w:val="16"/>
               </w:rPr>
-              <w:t>334</w:t>
+              <w:t>333</w:t>
             </w:r>
           </w:p>
         </w:tc>
@@ -8390,7 +8434,7 @@
               <w:rPr>
                 <w:sz w:val="16"/>
               </w:rPr>
-              <w:t>Community solar array at capacity — waitlist position assigned</w:t>
+              <w:t>Physician certification required within 30 days</w:t>
             </w:r>
           </w:p>
         </w:tc>
@@ -8407,7 +8451,7 @@
               <w:rPr>
                 <w:sz w:val="16"/>
               </w:rPr>
-              <w:t>335</w:t>
+              <w:t>334</w:t>
             </w:r>
           </w:p>
         </w:tc>
@@ -8437,7 +8481,7 @@
               <w:rPr>
                 <w:sz w:val="16"/>
               </w:rPr>
-              <w:t>Interval telemetry certification pending</w:t>
+              <w:t>Community solar array at capacity — waitlist position assigned</w:t>
             </w:r>
           </w:p>
         </w:tc>
@@ -8453,7 +8497,7 @@
               <w:rPr>
                 <w:sz w:val="16"/>
               </w:rPr>
-              <w:t>340</w:t>
+              <w:t>335</w:t>
             </w:r>
           </w:p>
         </w:tc>
@@ -8481,7 +8525,7 @@
               <w:rPr>
                 <w:sz w:val="16"/>
               </w:rPr>
-              <w:t>Enrollment replaces the active dynamic rate program &amp;1</w:t>
+              <w:t>Interval telemetry certification pending</w:t>
             </w:r>
           </w:p>
         </w:tc>
@@ -8498,7 +8542,7 @@
               <w:rPr>
                 <w:sz w:val="16"/>
               </w:rPr>
-              <w:t>341</w:t>
+              <w:t>340</w:t>
             </w:r>
           </w:p>
         </w:tc>
@@ -8528,7 +8572,7 @@
               <w:rPr>
                 <w:sz w:val="16"/>
               </w:rPr>
-              <w:t>Review stacking with active subscription &amp;1</w:t>
+              <w:t>Enrollment replaces the active dynamic rate program &amp;1</w:t>
             </w:r>
           </w:p>
         </w:tc>
@@ -8544,6 +8588,51 @@
               <w:rPr>
                 <w:sz w:val="16"/>
               </w:rPr>
+              <w:t>341</w:t>
+            </w:r>
+          </w:p>
+        </w:tc>
+        <w:tc>
+          <w:tcPr>
+            <w:tcW w:type="dxa" w:w="720"/>
+          </w:tcPr>
+          <w:p>
+            <w:r/>
+            <w:r>
+              <w:rPr>
+                <w:sz w:val="16"/>
+              </w:rPr>
+              <w:t>W</w:t>
+            </w:r>
+          </w:p>
+        </w:tc>
+        <w:tc>
+          <w:tcPr>
+            <w:tcW w:type="dxa" w:w="7776"/>
+          </w:tcPr>
+          <w:p>
+            <w:r/>
+            <w:r>
+              <w:rPr>
+                <w:sz w:val="16"/>
+              </w:rPr>
+              <w:t>Review stacking with active subscription &amp;1</w:t>
+            </w:r>
+          </w:p>
+        </w:tc>
+      </w:tr>
+      <w:tr>
+        <w:tc>
+          <w:tcPr>
+            <w:tcW w:type="dxa" w:w="864"/>
+            <w:shd w:val="clear" w:fill="DEEAF6"/>
+          </w:tcPr>
+          <w:p>
+            <w:r/>
+            <w:r>
+              <w:rPr>
+                <w:sz w:val="16"/>
+              </w:rPr>
               <w:t>342</w:t>
             </w:r>
           </w:p>
@@ -8551,6 +8640,7 @@
         <w:tc>
           <w:tcPr>
             <w:tcW w:type="dxa" w:w="720"/>
+            <w:shd w:val="clear" w:fill="DEEAF6"/>
           </w:tcPr>
           <w:p>
             <w:r/>
@@ -8565,6 +8655,7 @@
         <w:tc>
           <w:tcPr>
             <w:tcW w:type="dxa" w:w="7776"/>
+            <w:shd w:val="clear" w:fill="DEEAF6"/>
           </w:tcPr>
           <w:p>
             <w:r/>
@@ -9254,7 +9345,7 @@
               <w:rPr>
                 <w:sz w:val="17"/>
               </w:rPr>
-              <w:t>1 (33 messages)</w:t>
+              <w:t>1 (34 messages)</w:t>
             </w:r>
           </w:p>
         </w:tc>
@@ -9284,7 +9375,7 @@
         <w:rPr>
           <w:b w:val="0"/>
         </w:rPr>
-        <w:t>Mapping note: rule RU_&lt;PGM&gt;_020_HARDSTOPS evaluates the program's row of DT_PROGRAM_CRITERIA through a shared generic expression — each violated criterion appends its fixed ZEC_ELIG message (rate class → 002/003, AMI → 044, AMI comm → 018, prepay/medical/BB/DPA blocks → 052–057, arrears → 071/072, history → 062, load → 080, CA count → 074, extension → 073). Program-specific one-off conditions that do not fit the matrix (e.g., dynamic-rate mutual exclusion 058) remain in DT_PROGRAM_EXCLUSIONS.</w:t>
+        <w:t>Mapping note: rule RU_&lt;PGM&gt;_020_HARDSTOPS evaluates the program's row of DT_PROGRAM_CRITERIA through a shared generic expression — each violated criterion appends its fixed ZEC_ELIG message (rate class → 002/003, AMI → 044, AMI comm → 018, prepay/medical/BB/DPA blocks → 052–057, medical dynamic-pricing block → 053, arrears → 071/072, history → 062, load → 080, CA count → 074, extension → 073). Program-specific one-off conditions that do not fit the matrix (e.g., dynamic-rate mutual exclusion 058) remain in DT_PROGRAM_EXCLUSIONS.</w:t>
       </w:r>
     </w:p>
     <w:sectPr>

</xml_diff>